<commit_message>
Using text blocks just for readability
</commit_message>
<xml_diff>
--- a/Java Coding Problems/Chapter 1/3. Working with indentation in text blocks/Working with indentation in text blocks.docx
+++ b/Java Coding Problems/Chapter 1/3. Working with indentation in text blocks/Working with indentation in text blocks.docx
@@ -232,413 +232,597 @@
         </w:rPr>
         <w:t xml:space="preserve"> json</w:t>
       </w:r>
+      <w:r>
+        <w:rPr>
+          <w:rFonts w:ascii="Consolas" w:hAnsi="Consolas"/>
+          <w:color w:val="000000"/>
+          <w:sz w:val="20"/>
+          <w:szCs w:val="20"/>
+        </w:rPr>
+        <w:t xml:space="preserve"> = </w:t>
+      </w:r>
+      <w:r>
+        <w:rPr>
+          <w:rFonts w:ascii="Consolas" w:hAnsi="Consolas"/>
+          <w:color w:val="2A00FF"/>
+          <w:sz w:val="20"/>
+          <w:szCs w:val="20"/>
+        </w:rPr>
+        <w:t>"""</w:t>
+      </w:r>
+    </w:p>
+    <w:p>
+      <w:pPr>
+        <w:pStyle w:val="NormalWeb"/>
+        <w:shd w:val="clear" w:color="auto" w:fill="FFFFFF"/>
+        <w:spacing w:before="0" w:beforeAutospacing="0" w:after="0" w:afterAutospacing="0"/>
+        <w:rPr>
+          <w:rFonts w:ascii="Consolas" w:hAnsi="Consolas"/>
+          <w:color w:val="000000"/>
+          <w:sz w:val="20"/>
+          <w:szCs w:val="20"/>
+        </w:rPr>
+      </w:pPr>
+      <w:r>
+        <w:rPr>
+          <w:rFonts w:ascii="Consolas" w:hAnsi="Consolas"/>
+          <w:color w:val="2A00FF"/>
+          <w:sz w:val="20"/>
+          <w:szCs w:val="20"/>
+        </w:rPr>
+        <w:tab/>
+      </w:r>
+      <w:r>
+        <w:rPr>
+          <w:rFonts w:ascii="Consolas" w:hAnsi="Consolas"/>
+          <w:color w:val="2A00FF"/>
+          <w:sz w:val="20"/>
+          <w:szCs w:val="20"/>
+        </w:rPr>
+        <w:t>--------------********{</w:t>
+      </w:r>
+    </w:p>
+    <w:p>
+      <w:pPr>
+        <w:pStyle w:val="NormalWeb"/>
+        <w:shd w:val="clear" w:color="auto" w:fill="FFFFFF"/>
+        <w:spacing w:before="0" w:beforeAutospacing="0" w:after="0" w:afterAutospacing="0"/>
+        <w:rPr>
+          <w:rFonts w:ascii="Consolas" w:hAnsi="Consolas"/>
+          <w:color w:val="000000"/>
+          <w:sz w:val="20"/>
+          <w:szCs w:val="20"/>
+        </w:rPr>
+      </w:pPr>
+      <w:r>
+        <w:rPr>
+          <w:rFonts w:ascii="Consolas" w:hAnsi="Consolas"/>
+          <w:color w:val="2A00FF"/>
+          <w:sz w:val="20"/>
+          <w:szCs w:val="20"/>
+        </w:rPr>
+        <w:tab/>
+        <w:t>--------------********++"widget": {</w:t>
+      </w:r>
+    </w:p>
+    <w:p>
+      <w:pPr>
+        <w:pStyle w:val="NormalWeb"/>
+        <w:shd w:val="clear" w:color="auto" w:fill="FFFFFF"/>
+        <w:spacing w:before="0" w:beforeAutospacing="0" w:after="0" w:afterAutospacing="0"/>
+        <w:rPr>
+          <w:rFonts w:ascii="Consolas" w:hAnsi="Consolas"/>
+          <w:color w:val="000000"/>
+          <w:sz w:val="20"/>
+          <w:szCs w:val="20"/>
+        </w:rPr>
+      </w:pPr>
+      <w:r>
+        <w:rPr>
+          <w:rFonts w:ascii="Consolas" w:hAnsi="Consolas"/>
+          <w:color w:val="2A00FF"/>
+          <w:sz w:val="20"/>
+          <w:szCs w:val="20"/>
+        </w:rPr>
+        <w:tab/>
+        <w:t>--------------********++++"debug": "on",</w:t>
+      </w:r>
+    </w:p>
+    <w:p>
+      <w:pPr>
+        <w:pStyle w:val="NormalWeb"/>
+        <w:shd w:val="clear" w:color="auto" w:fill="FFFFFF"/>
+        <w:spacing w:before="0" w:beforeAutospacing="0" w:after="0" w:afterAutospacing="0"/>
+        <w:rPr>
+          <w:rFonts w:ascii="Consolas" w:hAnsi="Consolas"/>
+          <w:color w:val="000000"/>
+          <w:sz w:val="20"/>
+          <w:szCs w:val="20"/>
+        </w:rPr>
+      </w:pPr>
+      <w:r>
+        <w:rPr>
+          <w:rFonts w:ascii="Consolas" w:hAnsi="Consolas"/>
+          <w:color w:val="2A00FF"/>
+          <w:sz w:val="20"/>
+          <w:szCs w:val="20"/>
+        </w:rPr>
+        <w:tab/>
+        <w:t>--------------********++++"window": {</w:t>
+      </w:r>
+    </w:p>
+    <w:p>
+      <w:pPr>
+        <w:pStyle w:val="NormalWeb"/>
+        <w:shd w:val="clear" w:color="auto" w:fill="FFFFFF"/>
+        <w:spacing w:before="0" w:beforeAutospacing="0" w:after="0" w:afterAutospacing="0"/>
+        <w:rPr>
+          <w:rFonts w:ascii="Consolas" w:hAnsi="Consolas"/>
+          <w:color w:val="000000"/>
+          <w:sz w:val="20"/>
+          <w:szCs w:val="20"/>
+        </w:rPr>
+      </w:pPr>
+      <w:r>
+        <w:rPr>
+          <w:rFonts w:ascii="Consolas" w:hAnsi="Consolas"/>
+          <w:color w:val="2A00FF"/>
+          <w:sz w:val="20"/>
+          <w:szCs w:val="20"/>
+        </w:rPr>
+        <w:tab/>
+        <w:t>--------------********++++++"title": "Sample Widget 1",</w:t>
+      </w:r>
+    </w:p>
+    <w:p>
+      <w:pPr>
+        <w:pStyle w:val="NormalWeb"/>
+        <w:shd w:val="clear" w:color="auto" w:fill="FFFFFF"/>
+        <w:spacing w:before="0" w:beforeAutospacing="0" w:after="0" w:afterAutospacing="0"/>
+        <w:rPr>
+          <w:rFonts w:ascii="Consolas" w:hAnsi="Consolas"/>
+          <w:color w:val="000000"/>
+          <w:sz w:val="20"/>
+          <w:szCs w:val="20"/>
+        </w:rPr>
+      </w:pPr>
+      <w:r>
+        <w:rPr>
+          <w:rFonts w:ascii="Consolas" w:hAnsi="Consolas"/>
+          <w:color w:val="2A00FF"/>
+          <w:sz w:val="20"/>
+          <w:szCs w:val="20"/>
+        </w:rPr>
+        <w:tab/>
+        <w:t>--------------********++++++"name": "back_window"</w:t>
+      </w:r>
+    </w:p>
+    <w:p>
+      <w:pPr>
+        <w:pStyle w:val="NormalWeb"/>
+        <w:shd w:val="clear" w:color="auto" w:fill="FFFFFF"/>
+        <w:spacing w:before="0" w:beforeAutospacing="0" w:after="0" w:afterAutospacing="0"/>
+        <w:rPr>
+          <w:rFonts w:ascii="Consolas" w:hAnsi="Consolas"/>
+          <w:color w:val="000000"/>
+          <w:sz w:val="20"/>
+          <w:szCs w:val="20"/>
+        </w:rPr>
+      </w:pPr>
+      <w:r>
+        <w:rPr>
+          <w:rFonts w:ascii="Consolas" w:hAnsi="Consolas"/>
+          <w:color w:val="2A00FF"/>
+          <w:sz w:val="20"/>
+          <w:szCs w:val="20"/>
+        </w:rPr>
+        <w:tab/>
+        <w:t>--------------********++++},</w:t>
+      </w:r>
+    </w:p>
+    <w:p>
+      <w:pPr>
+        <w:pStyle w:val="NormalWeb"/>
+        <w:shd w:val="clear" w:color="auto" w:fill="FFFFFF"/>
+        <w:spacing w:before="0" w:beforeAutospacing="0" w:after="0" w:afterAutospacing="0"/>
+        <w:rPr>
+          <w:rFonts w:ascii="Consolas" w:hAnsi="Consolas"/>
+          <w:color w:val="000000"/>
+          <w:sz w:val="20"/>
+          <w:szCs w:val="20"/>
+        </w:rPr>
+      </w:pPr>
+      <w:r>
+        <w:rPr>
+          <w:rFonts w:ascii="Consolas" w:hAnsi="Consolas"/>
+          <w:color w:val="2A00FF"/>
+          <w:sz w:val="20"/>
+          <w:szCs w:val="20"/>
+        </w:rPr>
+        <w:tab/>
+        <w:t>--------------********++++"image": {</w:t>
+      </w:r>
+    </w:p>
+    <w:p>
+      <w:pPr>
+        <w:pStyle w:val="NormalWeb"/>
+        <w:shd w:val="clear" w:color="auto" w:fill="FFFFFF"/>
+        <w:spacing w:before="0" w:beforeAutospacing="0" w:after="0" w:afterAutospacing="0"/>
+        <w:rPr>
+          <w:rFonts w:ascii="Consolas" w:hAnsi="Consolas"/>
+          <w:color w:val="000000"/>
+          <w:sz w:val="20"/>
+          <w:szCs w:val="20"/>
+        </w:rPr>
+      </w:pPr>
+      <w:r>
+        <w:rPr>
+          <w:rFonts w:ascii="Consolas" w:hAnsi="Consolas"/>
+          <w:color w:val="2A00FF"/>
+          <w:sz w:val="20"/>
+          <w:szCs w:val="20"/>
+        </w:rPr>
+        <w:tab/>
+        <w:t>--------------********++++++"src": "images\\sw.png"</w:t>
+      </w:r>
+    </w:p>
+    <w:p>
+      <w:pPr>
+        <w:pStyle w:val="NormalWeb"/>
+        <w:shd w:val="clear" w:color="auto" w:fill="FFFFFF"/>
+        <w:spacing w:before="0" w:beforeAutospacing="0" w:after="0" w:afterAutospacing="0"/>
+        <w:rPr>
+          <w:rFonts w:ascii="Consolas" w:hAnsi="Consolas"/>
+          <w:color w:val="000000"/>
+          <w:sz w:val="20"/>
+          <w:szCs w:val="20"/>
+        </w:rPr>
+      </w:pPr>
+      <w:r>
+        <w:rPr>
+          <w:rFonts w:ascii="Consolas" w:hAnsi="Consolas"/>
+          <w:color w:val="2A00FF"/>
+          <w:sz w:val="20"/>
+          <w:szCs w:val="20"/>
+        </w:rPr>
+        <w:tab/>
+        <w:t>--------------********++++},</w:t>
+      </w:r>
+    </w:p>
+    <w:p>
+      <w:pPr>
+        <w:pStyle w:val="NormalWeb"/>
+        <w:shd w:val="clear" w:color="auto" w:fill="FFFFFF"/>
+        <w:spacing w:before="0" w:beforeAutospacing="0" w:after="0" w:afterAutospacing="0"/>
+        <w:rPr>
+          <w:rFonts w:ascii="Consolas" w:hAnsi="Consolas"/>
+          <w:color w:val="000000"/>
+          <w:sz w:val="20"/>
+          <w:szCs w:val="20"/>
+        </w:rPr>
+      </w:pPr>
+      <w:r>
+        <w:rPr>
+          <w:rFonts w:ascii="Consolas" w:hAnsi="Consolas"/>
+          <w:color w:val="2A00FF"/>
+          <w:sz w:val="20"/>
+          <w:szCs w:val="20"/>
+        </w:rPr>
+        <w:tab/>
+        <w:t>--------------********++++"text": {</w:t>
+      </w:r>
+    </w:p>
+    <w:p>
+      <w:pPr>
+        <w:pStyle w:val="NormalWeb"/>
+        <w:shd w:val="clear" w:color="auto" w:fill="FFFFFF"/>
+        <w:spacing w:before="0" w:beforeAutospacing="0" w:after="0" w:afterAutospacing="0"/>
+        <w:rPr>
+          <w:rFonts w:ascii="Consolas" w:hAnsi="Consolas"/>
+          <w:color w:val="000000"/>
+          <w:sz w:val="20"/>
+          <w:szCs w:val="20"/>
+        </w:rPr>
+      </w:pPr>
+      <w:r>
+        <w:rPr>
+          <w:rFonts w:ascii="Consolas" w:hAnsi="Consolas"/>
+          <w:color w:val="2A00FF"/>
+          <w:sz w:val="20"/>
+          <w:szCs w:val="20"/>
+        </w:rPr>
+        <w:tab/>
+        <w:t>--------------********++++++"data": "Click Me",</w:t>
+      </w:r>
+    </w:p>
+    <w:p>
+      <w:pPr>
+        <w:pStyle w:val="NormalWeb"/>
+        <w:shd w:val="clear" w:color="auto" w:fill="FFFFFF"/>
+        <w:spacing w:before="0" w:beforeAutospacing="0" w:after="0" w:afterAutospacing="0"/>
+        <w:rPr>
+          <w:rFonts w:ascii="Consolas" w:hAnsi="Consolas"/>
+          <w:color w:val="000000"/>
+          <w:sz w:val="20"/>
+          <w:szCs w:val="20"/>
+        </w:rPr>
+      </w:pPr>
+      <w:r>
+        <w:rPr>
+          <w:rFonts w:ascii="Consolas" w:hAnsi="Consolas"/>
+          <w:color w:val="2A00FF"/>
+          <w:sz w:val="20"/>
+          <w:szCs w:val="20"/>
+        </w:rPr>
+        <w:tab/>
+        <w:t>--------------********++++++"size": 39</w:t>
+      </w:r>
+    </w:p>
+    <w:p>
+      <w:pPr>
+        <w:pStyle w:val="NormalWeb"/>
+        <w:shd w:val="clear" w:color="auto" w:fill="FFFFFF"/>
+        <w:spacing w:before="0" w:beforeAutospacing="0" w:after="0" w:afterAutospacing="0"/>
+        <w:rPr>
+          <w:rFonts w:ascii="Consolas" w:hAnsi="Consolas"/>
+          <w:color w:val="000000"/>
+          <w:sz w:val="20"/>
+          <w:szCs w:val="20"/>
+        </w:rPr>
+      </w:pPr>
+      <w:r>
+        <w:rPr>
+          <w:rFonts w:ascii="Consolas" w:hAnsi="Consolas"/>
+          <w:color w:val="2A00FF"/>
+          <w:sz w:val="20"/>
+          <w:szCs w:val="20"/>
+        </w:rPr>
+        <w:tab/>
+        <w:t>--------------********++++}</w:t>
+      </w:r>
+    </w:p>
+    <w:p>
+      <w:pPr>
+        <w:pStyle w:val="NormalWeb"/>
+        <w:shd w:val="clear" w:color="auto" w:fill="FFFFFF"/>
+        <w:spacing w:before="0" w:beforeAutospacing="0" w:after="0" w:afterAutospacing="0"/>
+        <w:rPr>
+          <w:rFonts w:ascii="Consolas" w:hAnsi="Consolas"/>
+          <w:color w:val="000000"/>
+          <w:sz w:val="20"/>
+          <w:szCs w:val="20"/>
+        </w:rPr>
+      </w:pPr>
+      <w:r>
+        <w:rPr>
+          <w:rFonts w:ascii="Consolas" w:hAnsi="Consolas"/>
+          <w:color w:val="2A00FF"/>
+          <w:sz w:val="20"/>
+          <w:szCs w:val="20"/>
+        </w:rPr>
+        <w:tab/>
+        <w:t>--------------********++}</w:t>
+      </w:r>
+    </w:p>
+    <w:p>
+      <w:pPr>
+        <w:pStyle w:val="NormalWeb"/>
+        <w:shd w:val="clear" w:color="auto" w:fill="FFFFFF"/>
+        <w:spacing w:before="0" w:beforeAutospacing="0" w:after="0" w:afterAutospacing="0"/>
+        <w:rPr>
+          <w:rFonts w:ascii="Consolas" w:hAnsi="Consolas"/>
+          <w:color w:val="000000"/>
+          <w:sz w:val="20"/>
+          <w:szCs w:val="20"/>
+        </w:rPr>
+      </w:pPr>
+      <w:r>
+        <w:rPr>
+          <w:rFonts w:ascii="Consolas" w:hAnsi="Consolas"/>
+          <w:color w:val="2A00FF"/>
+          <w:sz w:val="20"/>
+          <w:szCs w:val="20"/>
+        </w:rPr>
+        <w:tab/>
+        <w:t>--------------********}"""</w:t>
+      </w:r>
+      <w:r>
+        <w:rPr>
+          <w:rFonts w:ascii="Consolas" w:hAnsi="Consolas"/>
+          <w:color w:val="000000"/>
+          <w:sz w:val="20"/>
+          <w:szCs w:val="20"/>
+        </w:rPr>
+        <w:t>.indent(8);</w:t>
+      </w:r>
+    </w:p>
+    <w:p/>
+    <w:p>
+      <w:r>
+        <w:t xml:space="preserve">The </w:t>
+      </w:r>
+      <w:proofErr w:type="gramStart"/>
+      <w:r>
+        <w:t>indent(</w:t>
+      </w:r>
+      <w:proofErr w:type="gramEnd"/>
+      <w:r>
+        <w:t>) method may be useful to align a block of content that contains lines of text placed at the same level of indentation, like the poem that follows:</w:t>
+      </w:r>
+    </w:p>
+    <w:p>
+      <w:pPr>
+        <w:pStyle w:val="NormalWeb"/>
+        <w:shd w:val="clear" w:color="auto" w:fill="FFFFFF"/>
+        <w:spacing w:before="0" w:beforeAutospacing="0" w:after="0" w:afterAutospacing="0"/>
+        <w:rPr>
+          <w:rFonts w:ascii="Consolas" w:hAnsi="Consolas"/>
+          <w:color w:val="000000"/>
+          <w:sz w:val="20"/>
+          <w:szCs w:val="20"/>
+        </w:rPr>
+      </w:pPr>
+      <w:r>
+        <w:rPr>
+          <w:rFonts w:ascii="Consolas" w:hAnsi="Consolas"/>
+          <w:color w:val="0066CC"/>
+          <w:sz w:val="20"/>
+          <w:szCs w:val="20"/>
+          <w:u w:val="single"/>
+        </w:rPr>
+        <w:t>String</w:t>
+      </w:r>
+      <w:r>
+        <w:rPr>
+          <w:rFonts w:ascii="Consolas" w:hAnsi="Consolas"/>
+          <w:color w:val="000000"/>
+          <w:sz w:val="20"/>
+          <w:szCs w:val="20"/>
+        </w:rPr>
+        <w:t xml:space="preserve"> </w:t>
+      </w:r>
+      <w:r>
+        <w:rPr>
+          <w:rFonts w:ascii="Consolas" w:hAnsi="Consolas"/>
+          <w:color w:val="6A3E3E"/>
+          <w:sz w:val="20"/>
+          <w:szCs w:val="20"/>
+          <w:u w:val="single"/>
+        </w:rPr>
+        <w:t>poem</w:t>
+      </w:r>
+      <w:r>
+        <w:rPr>
+          <w:rFonts w:ascii="Consolas" w:hAnsi="Consolas"/>
+          <w:color w:val="000000"/>
+          <w:sz w:val="20"/>
+          <w:szCs w:val="20"/>
+        </w:rPr>
+        <w:t xml:space="preserve"> = </w:t>
+      </w:r>
+      <w:r>
+        <w:rPr>
+          <w:rFonts w:ascii="Consolas" w:hAnsi="Consolas"/>
+          <w:color w:val="2A00FF"/>
+          <w:sz w:val="20"/>
+          <w:szCs w:val="20"/>
+        </w:rPr>
+        <w:t>"""</w:t>
+      </w:r>
+    </w:p>
+    <w:p>
+      <w:pPr>
+        <w:pStyle w:val="NormalWeb"/>
+        <w:shd w:val="clear" w:color="auto" w:fill="FFFFFF"/>
+        <w:spacing w:before="0" w:beforeAutospacing="0" w:after="0" w:afterAutospacing="0"/>
+        <w:rPr>
+          <w:rFonts w:ascii="Consolas" w:hAnsi="Consolas"/>
+          <w:color w:val="000000"/>
+          <w:sz w:val="20"/>
+          <w:szCs w:val="20"/>
+        </w:rPr>
+      </w:pPr>
+      <w:r>
+        <w:rPr>
+          <w:rFonts w:ascii="Consolas" w:hAnsi="Consolas"/>
+          <w:color w:val="2A00FF"/>
+          <w:sz w:val="20"/>
+          <w:szCs w:val="20"/>
+        </w:rPr>
+        <w:tab/>
+      </w:r>
+      <w:r>
+        <w:rPr>
+          <w:rFonts w:ascii="Consolas" w:hAnsi="Consolas"/>
+          <w:color w:val="2A00FF"/>
+          <w:sz w:val="20"/>
+          <w:szCs w:val="20"/>
+        </w:rPr>
+        <w:t>I would want to establish strength; root-like,</w:t>
+      </w:r>
+    </w:p>
+    <w:p>
+      <w:pPr>
+        <w:pStyle w:val="NormalWeb"/>
+        <w:shd w:val="clear" w:color="auto" w:fill="FFFFFF"/>
+        <w:spacing w:before="0" w:beforeAutospacing="0" w:after="0" w:afterAutospacing="0"/>
+        <w:rPr>
+          <w:rFonts w:ascii="Consolas" w:hAnsi="Consolas"/>
+          <w:color w:val="000000"/>
+          <w:sz w:val="20"/>
+          <w:szCs w:val="20"/>
+        </w:rPr>
+      </w:pPr>
+      <w:r>
+        <w:rPr>
+          <w:rFonts w:ascii="Consolas" w:hAnsi="Consolas"/>
+          <w:color w:val="2A00FF"/>
+          <w:sz w:val="20"/>
+          <w:szCs w:val="20"/>
+        </w:rPr>
+        <w:tab/>
+        <w:t>anchored in the hopes of solidity.</w:t>
+      </w:r>
+    </w:p>
+    <w:p>
+      <w:pPr>
+        <w:pStyle w:val="NormalWeb"/>
+        <w:shd w:val="clear" w:color="auto" w:fill="FFFFFF"/>
+        <w:spacing w:before="0" w:beforeAutospacing="0" w:after="0" w:afterAutospacing="0"/>
+        <w:rPr>
+          <w:rFonts w:ascii="Consolas" w:hAnsi="Consolas"/>
+          <w:color w:val="000000"/>
+          <w:sz w:val="20"/>
+          <w:szCs w:val="20"/>
+        </w:rPr>
+      </w:pPr>
+      <w:r>
+        <w:rPr>
+          <w:rFonts w:ascii="Consolas" w:hAnsi="Consolas"/>
+          <w:color w:val="2A00FF"/>
+          <w:sz w:val="20"/>
+          <w:szCs w:val="20"/>
+        </w:rPr>
+        <w:tab/>
+        <w:t>Forsake the contamination of instability.</w:t>
+      </w:r>
+    </w:p>
+    <w:p>
+      <w:pPr>
+        <w:pStyle w:val="NormalWeb"/>
+        <w:shd w:val="clear" w:color="auto" w:fill="FFFFFF"/>
+        <w:spacing w:before="0" w:beforeAutospacing="0" w:after="0" w:afterAutospacing="0"/>
+        <w:rPr>
+          <w:rFonts w:ascii="Consolas" w:hAnsi="Consolas"/>
+          <w:color w:val="000000"/>
+          <w:sz w:val="20"/>
+          <w:szCs w:val="20"/>
+        </w:rPr>
+      </w:pPr>
+      <w:r>
+        <w:rPr>
+          <w:rFonts w:ascii="Consolas" w:hAnsi="Consolas"/>
+          <w:color w:val="2A00FF"/>
+          <w:sz w:val="20"/>
+          <w:szCs w:val="20"/>
+        </w:rPr>
+        <w:tab/>
+        <w:t>Prove I'm the poet of each line of prose."""</w:t>
+      </w:r>
+      <w:r>
+        <w:rPr>
+          <w:rFonts w:ascii="Consolas" w:hAnsi="Consolas"/>
+          <w:color w:val="000000"/>
+          <w:sz w:val="20"/>
+          <w:szCs w:val="20"/>
+        </w:rPr>
+        <w:t>;</w:t>
+      </w:r>
+    </w:p>
+    <w:p>
       <w:bookmarkStart w:id="0" w:name="_GoBack"/>
       <w:bookmarkEnd w:id="0"/>
-      <w:r>
-        <w:rPr>
-          <w:rFonts w:ascii="Consolas" w:hAnsi="Consolas"/>
-          <w:color w:val="000000"/>
-          <w:sz w:val="20"/>
-          <w:szCs w:val="20"/>
-        </w:rPr>
-        <w:t xml:space="preserve"> = </w:t>
-      </w:r>
-      <w:r>
-        <w:rPr>
-          <w:rFonts w:ascii="Consolas" w:hAnsi="Consolas"/>
-          <w:color w:val="2A00FF"/>
-          <w:sz w:val="20"/>
-          <w:szCs w:val="20"/>
-        </w:rPr>
-        <w:t>"""</w:t>
-      </w:r>
-    </w:p>
-    <w:p>
-      <w:pPr>
-        <w:pStyle w:val="NormalWeb"/>
-        <w:shd w:val="clear" w:color="auto" w:fill="FFFFFF"/>
-        <w:spacing w:before="0" w:beforeAutospacing="0" w:after="0" w:afterAutospacing="0"/>
-        <w:rPr>
-          <w:rFonts w:ascii="Consolas" w:hAnsi="Consolas"/>
-          <w:color w:val="000000"/>
-          <w:sz w:val="20"/>
-          <w:szCs w:val="20"/>
-        </w:rPr>
-      </w:pPr>
-      <w:r>
-        <w:rPr>
-          <w:rFonts w:ascii="Consolas" w:hAnsi="Consolas"/>
-          <w:color w:val="2A00FF"/>
-          <w:sz w:val="20"/>
-          <w:szCs w:val="20"/>
-        </w:rPr>
-        <w:tab/>
-      </w:r>
-      <w:r>
-        <w:rPr>
-          <w:rFonts w:ascii="Consolas" w:hAnsi="Consolas"/>
-          <w:color w:val="2A00FF"/>
-          <w:sz w:val="20"/>
-          <w:szCs w:val="20"/>
-        </w:rPr>
-        <w:t>--------------********{</w:t>
-      </w:r>
-    </w:p>
-    <w:p>
-      <w:pPr>
-        <w:pStyle w:val="NormalWeb"/>
-        <w:shd w:val="clear" w:color="auto" w:fill="FFFFFF"/>
-        <w:spacing w:before="0" w:beforeAutospacing="0" w:after="0" w:afterAutospacing="0"/>
-        <w:rPr>
-          <w:rFonts w:ascii="Consolas" w:hAnsi="Consolas"/>
-          <w:color w:val="000000"/>
-          <w:sz w:val="20"/>
-          <w:szCs w:val="20"/>
-        </w:rPr>
-      </w:pPr>
-      <w:r>
-        <w:rPr>
-          <w:rFonts w:ascii="Consolas" w:hAnsi="Consolas"/>
-          <w:color w:val="2A00FF"/>
-          <w:sz w:val="20"/>
-          <w:szCs w:val="20"/>
-        </w:rPr>
-        <w:tab/>
-        <w:t>--------------********++"widget": {</w:t>
-      </w:r>
-    </w:p>
-    <w:p>
-      <w:pPr>
-        <w:pStyle w:val="NormalWeb"/>
-        <w:shd w:val="clear" w:color="auto" w:fill="FFFFFF"/>
-        <w:spacing w:before="0" w:beforeAutospacing="0" w:after="0" w:afterAutospacing="0"/>
-        <w:rPr>
-          <w:rFonts w:ascii="Consolas" w:hAnsi="Consolas"/>
-          <w:color w:val="000000"/>
-          <w:sz w:val="20"/>
-          <w:szCs w:val="20"/>
-        </w:rPr>
-      </w:pPr>
-      <w:r>
-        <w:rPr>
-          <w:rFonts w:ascii="Consolas" w:hAnsi="Consolas"/>
-          <w:color w:val="2A00FF"/>
-          <w:sz w:val="20"/>
-          <w:szCs w:val="20"/>
-        </w:rPr>
-        <w:tab/>
-        <w:t>--------------********++++"debug": "on",</w:t>
-      </w:r>
-    </w:p>
-    <w:p>
-      <w:pPr>
-        <w:pStyle w:val="NormalWeb"/>
-        <w:shd w:val="clear" w:color="auto" w:fill="FFFFFF"/>
-        <w:spacing w:before="0" w:beforeAutospacing="0" w:after="0" w:afterAutospacing="0"/>
-        <w:rPr>
-          <w:rFonts w:ascii="Consolas" w:hAnsi="Consolas"/>
-          <w:color w:val="000000"/>
-          <w:sz w:val="20"/>
-          <w:szCs w:val="20"/>
-        </w:rPr>
-      </w:pPr>
-      <w:r>
-        <w:rPr>
-          <w:rFonts w:ascii="Consolas" w:hAnsi="Consolas"/>
-          <w:color w:val="2A00FF"/>
-          <w:sz w:val="20"/>
-          <w:szCs w:val="20"/>
-        </w:rPr>
-        <w:tab/>
-        <w:t>--------------********++++"window": {</w:t>
-      </w:r>
-    </w:p>
-    <w:p>
-      <w:pPr>
-        <w:pStyle w:val="NormalWeb"/>
-        <w:shd w:val="clear" w:color="auto" w:fill="FFFFFF"/>
-        <w:spacing w:before="0" w:beforeAutospacing="0" w:after="0" w:afterAutospacing="0"/>
-        <w:rPr>
-          <w:rFonts w:ascii="Consolas" w:hAnsi="Consolas"/>
-          <w:color w:val="000000"/>
-          <w:sz w:val="20"/>
-          <w:szCs w:val="20"/>
-        </w:rPr>
-      </w:pPr>
-      <w:r>
-        <w:rPr>
-          <w:rFonts w:ascii="Consolas" w:hAnsi="Consolas"/>
-          <w:color w:val="2A00FF"/>
-          <w:sz w:val="20"/>
-          <w:szCs w:val="20"/>
-        </w:rPr>
-        <w:tab/>
-        <w:t>--------------********++++++"title": "Sample Widget 1",</w:t>
-      </w:r>
-    </w:p>
-    <w:p>
-      <w:pPr>
-        <w:pStyle w:val="NormalWeb"/>
-        <w:shd w:val="clear" w:color="auto" w:fill="FFFFFF"/>
-        <w:spacing w:before="0" w:beforeAutospacing="0" w:after="0" w:afterAutospacing="0"/>
-        <w:rPr>
-          <w:rFonts w:ascii="Consolas" w:hAnsi="Consolas"/>
-          <w:color w:val="000000"/>
-          <w:sz w:val="20"/>
-          <w:szCs w:val="20"/>
-        </w:rPr>
-      </w:pPr>
-      <w:r>
-        <w:rPr>
-          <w:rFonts w:ascii="Consolas" w:hAnsi="Consolas"/>
-          <w:color w:val="2A00FF"/>
-          <w:sz w:val="20"/>
-          <w:szCs w:val="20"/>
-        </w:rPr>
-        <w:tab/>
-        <w:t>--------------********++++++"name": "back_window"</w:t>
-      </w:r>
-    </w:p>
-    <w:p>
-      <w:pPr>
-        <w:pStyle w:val="NormalWeb"/>
-        <w:shd w:val="clear" w:color="auto" w:fill="FFFFFF"/>
-        <w:spacing w:before="0" w:beforeAutospacing="0" w:after="0" w:afterAutospacing="0"/>
-        <w:rPr>
-          <w:rFonts w:ascii="Consolas" w:hAnsi="Consolas"/>
-          <w:color w:val="000000"/>
-          <w:sz w:val="20"/>
-          <w:szCs w:val="20"/>
-        </w:rPr>
-      </w:pPr>
-      <w:r>
-        <w:rPr>
-          <w:rFonts w:ascii="Consolas" w:hAnsi="Consolas"/>
-          <w:color w:val="2A00FF"/>
-          <w:sz w:val="20"/>
-          <w:szCs w:val="20"/>
-        </w:rPr>
-        <w:tab/>
-        <w:t>--------------********++++},</w:t>
-      </w:r>
-    </w:p>
-    <w:p>
-      <w:pPr>
-        <w:pStyle w:val="NormalWeb"/>
-        <w:shd w:val="clear" w:color="auto" w:fill="FFFFFF"/>
-        <w:spacing w:before="0" w:beforeAutospacing="0" w:after="0" w:afterAutospacing="0"/>
-        <w:rPr>
-          <w:rFonts w:ascii="Consolas" w:hAnsi="Consolas"/>
-          <w:color w:val="000000"/>
-          <w:sz w:val="20"/>
-          <w:szCs w:val="20"/>
-        </w:rPr>
-      </w:pPr>
-      <w:r>
-        <w:rPr>
-          <w:rFonts w:ascii="Consolas" w:hAnsi="Consolas"/>
-          <w:color w:val="2A00FF"/>
-          <w:sz w:val="20"/>
-          <w:szCs w:val="20"/>
-        </w:rPr>
-        <w:tab/>
-        <w:t>--------------********++++"image": {</w:t>
-      </w:r>
-    </w:p>
-    <w:p>
-      <w:pPr>
-        <w:pStyle w:val="NormalWeb"/>
-        <w:shd w:val="clear" w:color="auto" w:fill="FFFFFF"/>
-        <w:spacing w:before="0" w:beforeAutospacing="0" w:after="0" w:afterAutospacing="0"/>
-        <w:rPr>
-          <w:rFonts w:ascii="Consolas" w:hAnsi="Consolas"/>
-          <w:color w:val="000000"/>
-          <w:sz w:val="20"/>
-          <w:szCs w:val="20"/>
-        </w:rPr>
-      </w:pPr>
-      <w:r>
-        <w:rPr>
-          <w:rFonts w:ascii="Consolas" w:hAnsi="Consolas"/>
-          <w:color w:val="2A00FF"/>
-          <w:sz w:val="20"/>
-          <w:szCs w:val="20"/>
-        </w:rPr>
-        <w:tab/>
-        <w:t>--------------********++++++"src": "images\\sw.png"</w:t>
-      </w:r>
-    </w:p>
-    <w:p>
-      <w:pPr>
-        <w:pStyle w:val="NormalWeb"/>
-        <w:shd w:val="clear" w:color="auto" w:fill="FFFFFF"/>
-        <w:spacing w:before="0" w:beforeAutospacing="0" w:after="0" w:afterAutospacing="0"/>
-        <w:rPr>
-          <w:rFonts w:ascii="Consolas" w:hAnsi="Consolas"/>
-          <w:color w:val="000000"/>
-          <w:sz w:val="20"/>
-          <w:szCs w:val="20"/>
-        </w:rPr>
-      </w:pPr>
-      <w:r>
-        <w:rPr>
-          <w:rFonts w:ascii="Consolas" w:hAnsi="Consolas"/>
-          <w:color w:val="2A00FF"/>
-          <w:sz w:val="20"/>
-          <w:szCs w:val="20"/>
-        </w:rPr>
-        <w:tab/>
-        <w:t>--------------********++++},</w:t>
-      </w:r>
-    </w:p>
-    <w:p>
-      <w:pPr>
-        <w:pStyle w:val="NormalWeb"/>
-        <w:shd w:val="clear" w:color="auto" w:fill="FFFFFF"/>
-        <w:spacing w:before="0" w:beforeAutospacing="0" w:after="0" w:afterAutospacing="0"/>
-        <w:rPr>
-          <w:rFonts w:ascii="Consolas" w:hAnsi="Consolas"/>
-          <w:color w:val="000000"/>
-          <w:sz w:val="20"/>
-          <w:szCs w:val="20"/>
-        </w:rPr>
-      </w:pPr>
-      <w:r>
-        <w:rPr>
-          <w:rFonts w:ascii="Consolas" w:hAnsi="Consolas"/>
-          <w:color w:val="2A00FF"/>
-          <w:sz w:val="20"/>
-          <w:szCs w:val="20"/>
-        </w:rPr>
-        <w:tab/>
-        <w:t>--------------********++++"text": {</w:t>
-      </w:r>
-    </w:p>
-    <w:p>
-      <w:pPr>
-        <w:pStyle w:val="NormalWeb"/>
-        <w:shd w:val="clear" w:color="auto" w:fill="FFFFFF"/>
-        <w:spacing w:before="0" w:beforeAutospacing="0" w:after="0" w:afterAutospacing="0"/>
-        <w:rPr>
-          <w:rFonts w:ascii="Consolas" w:hAnsi="Consolas"/>
-          <w:color w:val="000000"/>
-          <w:sz w:val="20"/>
-          <w:szCs w:val="20"/>
-        </w:rPr>
-      </w:pPr>
-      <w:r>
-        <w:rPr>
-          <w:rFonts w:ascii="Consolas" w:hAnsi="Consolas"/>
-          <w:color w:val="2A00FF"/>
-          <w:sz w:val="20"/>
-          <w:szCs w:val="20"/>
-        </w:rPr>
-        <w:tab/>
-        <w:t>--------------********++++++"data": "Click Me",</w:t>
-      </w:r>
-    </w:p>
-    <w:p>
-      <w:pPr>
-        <w:pStyle w:val="NormalWeb"/>
-        <w:shd w:val="clear" w:color="auto" w:fill="FFFFFF"/>
-        <w:spacing w:before="0" w:beforeAutospacing="0" w:after="0" w:afterAutospacing="0"/>
-        <w:rPr>
-          <w:rFonts w:ascii="Consolas" w:hAnsi="Consolas"/>
-          <w:color w:val="000000"/>
-          <w:sz w:val="20"/>
-          <w:szCs w:val="20"/>
-        </w:rPr>
-      </w:pPr>
-      <w:r>
-        <w:rPr>
-          <w:rFonts w:ascii="Consolas" w:hAnsi="Consolas"/>
-          <w:color w:val="2A00FF"/>
-          <w:sz w:val="20"/>
-          <w:szCs w:val="20"/>
-        </w:rPr>
-        <w:tab/>
-        <w:t>--------------********++++++"size": 39</w:t>
-      </w:r>
-    </w:p>
-    <w:p>
-      <w:pPr>
-        <w:pStyle w:val="NormalWeb"/>
-        <w:shd w:val="clear" w:color="auto" w:fill="FFFFFF"/>
-        <w:spacing w:before="0" w:beforeAutospacing="0" w:after="0" w:afterAutospacing="0"/>
-        <w:rPr>
-          <w:rFonts w:ascii="Consolas" w:hAnsi="Consolas"/>
-          <w:color w:val="000000"/>
-          <w:sz w:val="20"/>
-          <w:szCs w:val="20"/>
-        </w:rPr>
-      </w:pPr>
-      <w:r>
-        <w:rPr>
-          <w:rFonts w:ascii="Consolas" w:hAnsi="Consolas"/>
-          <w:color w:val="2A00FF"/>
-          <w:sz w:val="20"/>
-          <w:szCs w:val="20"/>
-        </w:rPr>
-        <w:tab/>
-        <w:t>--------------********++++}</w:t>
-      </w:r>
-    </w:p>
-    <w:p>
-      <w:pPr>
-        <w:pStyle w:val="NormalWeb"/>
-        <w:shd w:val="clear" w:color="auto" w:fill="FFFFFF"/>
-        <w:spacing w:before="0" w:beforeAutospacing="0" w:after="0" w:afterAutospacing="0"/>
-        <w:rPr>
-          <w:rFonts w:ascii="Consolas" w:hAnsi="Consolas"/>
-          <w:color w:val="000000"/>
-          <w:sz w:val="20"/>
-          <w:szCs w:val="20"/>
-        </w:rPr>
-      </w:pPr>
-      <w:r>
-        <w:rPr>
-          <w:rFonts w:ascii="Consolas" w:hAnsi="Consolas"/>
-          <w:color w:val="2A00FF"/>
-          <w:sz w:val="20"/>
-          <w:szCs w:val="20"/>
-        </w:rPr>
-        <w:tab/>
-        <w:t>--------------********++}</w:t>
-      </w:r>
-    </w:p>
-    <w:p>
-      <w:pPr>
-        <w:pStyle w:val="NormalWeb"/>
-        <w:shd w:val="clear" w:color="auto" w:fill="FFFFFF"/>
-        <w:spacing w:before="0" w:beforeAutospacing="0" w:after="0" w:afterAutospacing="0"/>
-        <w:rPr>
-          <w:rFonts w:ascii="Consolas" w:hAnsi="Consolas"/>
-          <w:color w:val="000000"/>
-          <w:sz w:val="20"/>
-          <w:szCs w:val="20"/>
-        </w:rPr>
-      </w:pPr>
-      <w:r>
-        <w:rPr>
-          <w:rFonts w:ascii="Consolas" w:hAnsi="Consolas"/>
-          <w:color w:val="2A00FF"/>
-          <w:sz w:val="20"/>
-          <w:szCs w:val="20"/>
-        </w:rPr>
-        <w:tab/>
-        <w:t>--------------********}"""</w:t>
-      </w:r>
-      <w:r>
-        <w:rPr>
-          <w:rFonts w:ascii="Consolas" w:hAnsi="Consolas"/>
-          <w:color w:val="000000"/>
-          <w:sz w:val="20"/>
-          <w:szCs w:val="20"/>
-        </w:rPr>
-        <w:t>.indent(8);</w:t>
-      </w:r>
-    </w:p>
-    <w:p/>
+    </w:p>
     <w:sectPr>
       <w:pgSz w:w="11906" w:h="16838"/>
       <w:pgMar w:top="1440" w:right="1440" w:bottom="1440" w:left="1440" w:header="708" w:footer="708" w:gutter="0"/>

</xml_diff>